<commit_message>
chore: update Abstract.docx to refine keywords and improve clarity in documentation
</commit_message>
<xml_diff>
--- a/Documentation/Abstract.docx
+++ b/Documentation/Abstract.docx
@@ -243,48 +243,19 @@
     </w:p>
     <w:p>
       <w:pPr>
-        <w:spacing w:before="240" w:after="160" w:line="360" w:lineRule="auto"/>
+        <w:pStyle w:val="NormalWeb"/>
+        <w:spacing w:line="360" w:lineRule="auto"/>
         <w:jc w:val="both"/>
+      </w:pPr>
+      <w:r>
         <w:rPr>
-          <w:rFonts w:ascii="Times New Roman" w:eastAsia="Aptos" w:hAnsi="Times New Roman" w:cs="Times New Roman"/>
-          <w:b/>
-          <w:bCs/>
-          <w:kern w:val="2"/>
-          <w:sz w:val="24"/>
-          <w:szCs w:val="24"/>
-          <w14:ligatures w14:val="standardContextual"/>
+          <w:rStyle w:val="Strong"/>
         </w:rPr>
-      </w:pPr>
-    </w:p>
-    <w:p>
-      <w:pPr>
-        <w:spacing w:before="240" w:after="160" w:line="360" w:lineRule="auto"/>
-        <w:jc w:val="both"/>
-        <w:rPr>
-          <w:rFonts w:ascii="Times New Roman" w:eastAsia="Aptos" w:hAnsi="Times New Roman" w:cs="Times New Roman"/>
-          <w:b/>
-          <w:bCs/>
-          <w:kern w:val="2"/>
-          <w:sz w:val="24"/>
-          <w:szCs w:val="24"/>
-          <w14:ligatures w14:val="standardContextual"/>
-        </w:rPr>
-      </w:pPr>
-    </w:p>
-    <w:p>
-      <w:pPr>
-        <w:spacing w:before="240" w:after="160" w:line="360" w:lineRule="auto"/>
-        <w:jc w:val="both"/>
-        <w:rPr>
-          <w:rFonts w:ascii="Times New Roman" w:eastAsia="Aptos" w:hAnsi="Times New Roman" w:cs="Times New Roman"/>
-          <w:b/>
-          <w:bCs/>
-          <w:kern w:val="2"/>
-          <w:sz w:val="24"/>
-          <w:szCs w:val="24"/>
-          <w14:ligatures w14:val="standardContextual"/>
-        </w:rPr>
-      </w:pPr>
+        <w:t>Keywords</w:t>
+      </w:r>
+      <w:r>
+        <w:t>: Artificial intelligence, Recruitment technology, Candidate verification, conversational AI, Applicant tracking systems</w:t>
+      </w:r>
     </w:p>
     <w:p>
       <w:pPr>
@@ -372,6 +343,7 @@
           <w:rFonts w:ascii="Times New Roman" w:hAnsi="Times New Roman" w:cs="Times New Roman"/>
           <w:color w:val="000000" w:themeColor="text1"/>
         </w:rPr>
+        <w:lastRenderedPageBreak/>
         <w:t>List of Figures</w:t>
       </w:r>
     </w:p>
@@ -1952,7 +1924,7 @@
     </w:p>
     <w:tbl>
       <w:tblPr>
-        <w:tblW w:w="9308" w:type="dxa"/>
+        <w:tblW w:w="8788" w:type="dxa"/>
         <w:tblBorders>
           <w:top w:val="single" w:sz="1" w:space="0" w:color="CCCCCC"/>
           <w:left w:val="single" w:sz="1" w:space="0" w:color="CCCCCC"/>
@@ -1970,7 +1942,7 @@
       <w:tblGrid>
         <w:gridCol w:w="1432"/>
         <w:gridCol w:w="5728"/>
-        <w:gridCol w:w="2148"/>
+        <w:gridCol w:w="1628"/>
       </w:tblGrid>
       <w:tr>
         <w:trPr>
@@ -2045,7 +2017,7 @@
         </w:tc>
         <w:tc>
           <w:tcPr>
-            <w:tcW w:w="2148" w:type="dxa"/>
+            <w:tcW w:w="1628" w:type="dxa"/>
             <w:shd w:val="clear" w:color="auto" w:fill="1F4E79"/>
             <w:tcMar>
               <w:top w:w="80" w:type="dxa"/>
@@ -2167,7 +2139,7 @@
         </w:tc>
         <w:tc>
           <w:tcPr>
-            <w:tcW w:w="2148" w:type="dxa"/>
+            <w:tcW w:w="1628" w:type="dxa"/>
             <w:shd w:val="clear" w:color="auto" w:fill="EBF3FB"/>
             <w:tcMar>
               <w:top w:w="80" w:type="dxa"/>
@@ -2268,7 +2240,7 @@
         </w:tc>
         <w:tc>
           <w:tcPr>
-            <w:tcW w:w="2148" w:type="dxa"/>
+            <w:tcW w:w="1628" w:type="dxa"/>
             <w:shd w:val="clear" w:color="auto" w:fill="FFFFFF"/>
             <w:tcMar>
               <w:top w:w="80" w:type="dxa"/>
@@ -2369,7 +2341,7 @@
         </w:tc>
         <w:tc>
           <w:tcPr>
-            <w:tcW w:w="2148" w:type="dxa"/>
+            <w:tcW w:w="1628" w:type="dxa"/>
             <w:shd w:val="clear" w:color="auto" w:fill="EBF3FB"/>
             <w:tcMar>
               <w:top w:w="80" w:type="dxa"/>
@@ -2470,7 +2442,7 @@
         </w:tc>
         <w:tc>
           <w:tcPr>
-            <w:tcW w:w="2148" w:type="dxa"/>
+            <w:tcW w:w="1628" w:type="dxa"/>
             <w:shd w:val="clear" w:color="auto" w:fill="FFFFFF"/>
             <w:tcMar>
               <w:top w:w="80" w:type="dxa"/>
@@ -2571,7 +2543,7 @@
         </w:tc>
         <w:tc>
           <w:tcPr>
-            <w:tcW w:w="2148" w:type="dxa"/>
+            <w:tcW w:w="1628" w:type="dxa"/>
             <w:shd w:val="clear" w:color="auto" w:fill="EBF3FB"/>
             <w:tcMar>
               <w:top w:w="80" w:type="dxa"/>
@@ -2672,7 +2644,7 @@
         </w:tc>
         <w:tc>
           <w:tcPr>
-            <w:tcW w:w="2148" w:type="dxa"/>
+            <w:tcW w:w="1628" w:type="dxa"/>
             <w:shd w:val="clear" w:color="auto" w:fill="FFFFFF"/>
             <w:tcMar>
               <w:top w:w="80" w:type="dxa"/>
@@ -2773,7 +2745,7 @@
         </w:tc>
         <w:tc>
           <w:tcPr>
-            <w:tcW w:w="2148" w:type="dxa"/>
+            <w:tcW w:w="1628" w:type="dxa"/>
             <w:shd w:val="clear" w:color="auto" w:fill="EBF3FB"/>
             <w:tcMar>
               <w:top w:w="80" w:type="dxa"/>
@@ -2874,7 +2846,7 @@
         </w:tc>
         <w:tc>
           <w:tcPr>
-            <w:tcW w:w="2148" w:type="dxa"/>
+            <w:tcW w:w="1628" w:type="dxa"/>
             <w:shd w:val="clear" w:color="auto" w:fill="FFFFFF"/>
             <w:tcMar>
               <w:top w:w="80" w:type="dxa"/>
@@ -2975,7 +2947,7 @@
         </w:tc>
         <w:tc>
           <w:tcPr>
-            <w:tcW w:w="2148" w:type="dxa"/>
+            <w:tcW w:w="1628" w:type="dxa"/>
             <w:shd w:val="clear" w:color="auto" w:fill="EBF3FB"/>
             <w:tcMar>
               <w:top w:w="80" w:type="dxa"/>
@@ -3076,7 +3048,7 @@
         </w:tc>
         <w:tc>
           <w:tcPr>
-            <w:tcW w:w="2148" w:type="dxa"/>
+            <w:tcW w:w="1628" w:type="dxa"/>
             <w:shd w:val="clear" w:color="auto" w:fill="FFFFFF"/>
             <w:tcMar>
               <w:top w:w="80" w:type="dxa"/>
@@ -3177,7 +3149,7 @@
         </w:tc>
         <w:tc>
           <w:tcPr>
-            <w:tcW w:w="2148" w:type="dxa"/>
+            <w:tcW w:w="1628" w:type="dxa"/>
             <w:shd w:val="clear" w:color="auto" w:fill="EBF3FB"/>
             <w:tcMar>
               <w:top w:w="80" w:type="dxa"/>
@@ -3278,7 +3250,7 @@
         </w:tc>
         <w:tc>
           <w:tcPr>
-            <w:tcW w:w="2148" w:type="dxa"/>
+            <w:tcW w:w="1628" w:type="dxa"/>
             <w:shd w:val="clear" w:color="auto" w:fill="FFFFFF"/>
             <w:tcMar>
               <w:top w:w="80" w:type="dxa"/>
@@ -3379,7 +3351,7 @@
         </w:tc>
         <w:tc>
           <w:tcPr>
-            <w:tcW w:w="2148" w:type="dxa"/>
+            <w:tcW w:w="1628" w:type="dxa"/>
             <w:shd w:val="clear" w:color="auto" w:fill="FFFFFF"/>
             <w:tcMar>
               <w:top w:w="80" w:type="dxa"/>
@@ -3474,13 +3446,13 @@
                 <w:sz w:val="24"/>
                 <w:szCs w:val="24"/>
               </w:rPr>
-              <w:t>Comparison of Algorithms and Techniques</w:t>
-            </w:r>
-          </w:p>
-        </w:tc>
-        <w:tc>
-          <w:tcPr>
-            <w:tcW w:w="2148" w:type="dxa"/>
+              <w:t>Comparison of Techniques</w:t>
+            </w:r>
+          </w:p>
+        </w:tc>
+        <w:tc>
+          <w:tcPr>
+            <w:tcW w:w="1628" w:type="dxa"/>
             <w:shd w:val="clear" w:color="auto" w:fill="EBF3FB"/>
             <w:tcMar>
               <w:top w:w="80" w:type="dxa"/>
@@ -5024,7 +4996,7 @@
     <w:sectPr>
       <w:footerReference w:type="default" r:id="rId8"/>
       <w:pgSz w:w="11906" w:h="16838" w:code="9"/>
-      <w:pgMar w:top="1440" w:right="1440" w:bottom="1440" w:left="1728" w:header="706" w:footer="706" w:gutter="0"/>
+      <w:pgMar w:top="1440" w:right="1440" w:bottom="1440" w:left="1440" w:header="706" w:footer="706" w:gutter="0"/>
       <w:pgNumType w:fmt="lowerRoman"/>
       <w:cols w:space="708"/>
       <w:docGrid w:linePitch="360"/>
@@ -5082,6 +5054,7 @@
       </w:rPr>
       <w:t>(</w:t>
     </w:r>
+    <w:proofErr w:type="spellStart"/>
     <w:sdt>
       <w:sdtPr>
         <w:rPr>
@@ -5144,6 +5117,7 @@
           </w:rPr>
           <w:t>i</w:t>
         </w:r>
+        <w:proofErr w:type="spellEnd"/>
         <w:r>
           <w:rPr>
             <w:rFonts w:asciiTheme="majorBidi" w:hAnsiTheme="majorBidi" w:cstheme="majorBidi"/>

</xml_diff>